<commit_message>
Apply corrected patient note: doses, regimen taken, tirzepatide, cold intolerance
Co-Authored-By: Claude Opus 5.5 <noreply@anthropic.com>
Claude-Session: https://claude.ai/code/session_016DtN4Lj3ZochxyKgWBJhv4
</commit_message>
<xml_diff>
--- a/My latest Info.docx
+++ b/My latest Info.docx
@@ -2,6 +2,73 @@
 <file path=word/document.xml><?xml version="1.0" encoding="utf-8"?>
 <w:document xmlns:wpc="http://schemas.microsoft.com/office/word/2010/wordprocessingCanvas" xmlns:cx="http://schemas.microsoft.com/office/drawing/2014/chartex" xmlns:cx1="http://schemas.microsoft.com/office/drawing/2015/9/8/chartex" xmlns:cx2="http://schemas.microsoft.com/office/drawing/2015/10/21/chartex" xmlns:cx3="http://schemas.microsoft.com/office/drawing/2016/5/9/chartex" xmlns:cx4="http://schemas.microsoft.com/office/drawing/2016/5/10/chartex" xmlns:cx5="http://schemas.microsoft.com/office/drawing/2016/5/11/chartex" xmlns:cx6="http://schemas.microsoft.com/office/drawing/2016/5/12/chartex" xmlns:cx7="http://schemas.microsoft.com/office/drawing/2016/5/13/chartex" xmlns:cx8="http://schemas.microsoft.com/office/drawing/2016/5/14/chartex" xmlns:mc="http://schemas.openxmlformats.org/markup-compatibility/2006" xmlns:aink="http://schemas.microsoft.com/office/drawing/2016/ink" xmlns:am3d="http://schemas.microsoft.com/office/drawing/2017/model3d" xmlns:o="urn:schemas-microsoft-com:office:office" xmlns:oel="http://schemas.microsoft.com/office/2019/extlst" xmlns:r="http://schemas.openxmlformats.org/officeDocument/2006/relationships" xmlns:m="http://schemas.openxmlformats.org/officeDocument/2006/math" xmlns:v="urn:schemas-microsoft-com:vml" xmlns:wp14="http://schemas.microsoft.com/office/word/2010/wordprocessingDrawing" xmlns:wp="http://schemas.openxmlformats.org/drawingml/2006/wordprocessingDrawing" xmlns:w10="urn:schemas-microsoft-com:office:word" xmlns:w="http://schemas.openxmlformats.org/wordprocessingml/2006/main" xmlns:w14="http://schemas.microsoft.com/office/word/2010/wordml" xmlns:w15="http://schemas.microsoft.com/office/word/2012/wordml" xmlns:w16cex="http://schemas.microsoft.com/office/word/2018/wordml/cex" xmlns:w16cid="http://schemas.microsoft.com/office/word/2016/wordml/cid" xmlns:w16="http://schemas.microsoft.com/office/word/2018/wordml" xmlns:w16du="http://schemas.microsoft.com/office/word/2023/wordml/word16du" xmlns:w16sdtdh="http://schemas.microsoft.com/office/word/2020/wordml/sdtdatahash" xmlns:w16sdtfl="http://schemas.microsoft.com/office/word/2024/wordml/sdtformatlock" xmlns:w16se="http://schemas.microsoft.com/office/word/2015/wordml/symex" xmlns:wpg="http://schemas.microsoft.com/office/word/2010/wordprocessingGroup" xmlns:wpi="http://schemas.microsoft.com/office/word/2010/wordprocessingInk" xmlns:wne="http://schemas.microsoft.com/office/word/2006/wordml" xmlns:wps="http://schemas.microsoft.com/office/word/2010/wordprocessingShape" mc:Ignorable="w14 w15 w16se w16cid w16 w16cex w16sdtdh w16sdtfl w16du wp14">
   <w:body>
+    <w:p>
+      <w:pPr>
+        <w:numPr>
+          <w:ilvl w:val="0"/>
+          <w:numId w:val="2"/>
+        </w:numPr>
+      </w:pPr>
+      <w:r>
+        <w:rPr>
+          <w:b/>
+        </w:rPr>
+        <w:t>Levofloxacin, 6 Jun 2026:</w:t>
+      </w:r>
+      <w:r>
+        <w:t xml:space="preserve"> the prescription reads </w:t>
+      </w:r>
+      <w:r>
+        <w:t>1</w:t>
+      </w:r>
+      <w:r>
+        <w:t xml:space="preserve"> tablet at night (0+0+</w:t>
+      </w:r>
+      <w:r>
+        <w:t>1)</w:t>
+      </w:r>
+    </w:p>
+    <w:p>
+      <w:pPr>
+        <w:numPr>
+          <w:ilvl w:val="0"/>
+          <w:numId w:val="2"/>
+        </w:numPr>
+      </w:pPr>
+      <w:r>
+        <w:rPr>
+          <w:b/>
+        </w:rPr>
+        <w:t>Dexlansoprazole, 10 Sep 2026:</w:t>
+      </w:r>
+      <w:r>
+        <w:t xml:space="preserve"> the prescription </w:t>
+      </w:r>
+      <w:r>
+        <w:t xml:space="preserve"> says </w:t>
+      </w:r>
+      <w:r>
+        <w:t xml:space="preserve"> </w:t>
+      </w:r>
+      <w:r>
+        <w:t>1</w:t>
+      </w:r>
+      <w:r>
+        <w:t xml:space="preserve">+0+2; </w:t>
+      </w:r>
+      <w:r>
+        <w:t>my</w:t>
+      </w:r>
+      <w:r>
+        <w:t xml:space="preserve"> note </w:t>
+      </w:r>
+      <w:r>
+        <w:t xml:space="preserve">also </w:t>
+      </w:r>
+      <w:r>
+        <w:t>says 1+0+2.</w:t>
+      </w:r>
+    </w:p>
     <w:p/>
     <w:p/>
     <w:p>
@@ -29,7 +96,19 @@
     <w:p/>
     <w:p>
       <w:r>
-        <w:t xml:space="preserve">Tab Evo 500 (Levofloxacin), 2 </w:t>
+        <w:t xml:space="preserve">Tab Evo 500 (Levofloxacin), </w:t>
+      </w:r>
+      <w:r>
+        <w:t>1</w:t>
+      </w:r>
+      <w:r>
+        <w:t xml:space="preserve"> tab a day for 14 days</w:t>
+      </w:r>
+    </w:p>
+    <w:p/>
+    <w:p>
+      <w:r>
+        <w:t xml:space="preserve">Cap Moxil 500 (Amoxicillin) 500, 2 </w:t>
       </w:r>
       <w:proofErr w:type="gramStart"/>
       <w:r>
@@ -37,27 +116,25 @@
       </w:r>
       <w:proofErr w:type="gramEnd"/>
       <w:r>
-        <w:t xml:space="preserve"> twice a day for 14 days</w:t>
+        <w:t xml:space="preserve"> twice </w:t>
+      </w:r>
+      <w:r>
+        <w:t xml:space="preserve">a </w:t>
+      </w:r>
+      <w:r>
+        <w:t xml:space="preserve">day for 14 days. </w:t>
       </w:r>
     </w:p>
     <w:p/>
     <w:p>
       <w:r>
-        <w:t xml:space="preserve">Cap Moxil 500 (Amoxicillin) 500, 2 </w:t>
-      </w:r>
-      <w:proofErr w:type="gramStart"/>
-      <w:r>
-        <w:t>tab</w:t>
-      </w:r>
-      <w:proofErr w:type="gramEnd"/>
-      <w:r>
-        <w:t xml:space="preserve"> twice day for 14 days. </w:t>
-      </w:r>
-    </w:p>
-    <w:p/>
-    <w:p>
-      <w:r>
-        <w:t xml:space="preserve">For the management of Ulver healing and H. </w:t>
+        <w:t>For the management of Ul</w:t>
+      </w:r>
+      <w:r>
+        <w:t>c</w:t>
+      </w:r>
+      <w:r>
+        <w:t xml:space="preserve">er healing and H. </w:t>
       </w:r>
       <w:r>
         <w:t>Pylori</w:t>
@@ -225,6 +302,11 @@
     <w:p/>
     <w:p>
       <w:r>
+        <w:t>Tab Esomeprazole 20 mg twice a day</w:t>
+      </w:r>
+    </w:p>
+    <w:p>
+      <w:r>
         <w:t xml:space="preserve">Tab Fimoxyclav 1 gm (Amoxicillin 875 mg + </w:t>
       </w:r>
       <w:r>
@@ -326,7 +408,49 @@
     <w:p/>
     <w:p>
       <w:r>
-        <w:t xml:space="preserve">I took Dexlansoprazole 30 mg 1+0+2, for 3 days day, then I continued as 1 + 0 + 1  daily. </w:t>
+        <w:t>I took Dexlansoprazole 30 mg 1+0+2, for 3 day</w:t>
+      </w:r>
+      <w:r>
+        <w:t>s</w:t>
+      </w:r>
+      <w:r>
+        <w:t xml:space="preserve">, then I </w:t>
+      </w:r>
+      <w:r>
+        <w:t xml:space="preserve">am continuing </w:t>
+      </w:r>
+      <w:r>
+        <w:t xml:space="preserve"> as 1 + 0 + 1  daily</w:t>
+      </w:r>
+      <w:r>
+        <w:t xml:space="preserve"> as of today 24 October 2026 and intend to continue till 30 November 2026 or until I see a doctor, whichever is earlier</w:t>
+      </w:r>
+      <w:r>
+        <w:t xml:space="preserve">. </w:t>
+      </w:r>
+      <w:r>
+        <w:t xml:space="preserve">And I took Cap Amoxicillin 500mg, 2 tablets twice a day and Tab Levofloxacin 500 mg once a day for 14 days. </w:t>
+      </w:r>
+    </w:p>
+    <w:p/>
+    <w:p>
+      <w:r>
+        <w:t>Since late 2024, I have severe sold sensitivity</w:t>
+      </w:r>
+      <w:r>
+        <w:t xml:space="preserve">; even at 28 deg C temperature in an AC room I feel cold. </w:t>
+      </w:r>
+    </w:p>
+    <w:p/>
+    <w:p>
+      <w:r>
+        <w:t xml:space="preserve">Between September 2025 to June 2026, I took a couple of </w:t>
+      </w:r>
+      <w:r>
+        <w:t>Tirzepatide</w:t>
+      </w:r>
+      <w:r>
+        <w:t xml:space="preserve"> shots as per my last Bariatric surgeon to reduce my weight. When my weight decreased to 69 kg (10 kg reduction), I stopped taking Tirzepatide injection. I am 72 kg now. </w:t>
       </w:r>
     </w:p>
     <w:sectPr>
@@ -342,6 +466,155 @@
 <file path=word/numbering.xml><?xml version="1.0" encoding="utf-8"?>
 <w:numbering xmlns:wpc="http://schemas.microsoft.com/office/word/2010/wordprocessingCanvas" xmlns:cx="http://schemas.microsoft.com/office/drawing/2014/chartex" xmlns:cx1="http://schemas.microsoft.com/office/drawing/2015/9/8/chartex" xmlns:cx2="http://schemas.microsoft.com/office/drawing/2015/10/21/chartex" xmlns:cx3="http://schemas.microsoft.com/office/drawing/2016/5/9/chartex" xmlns:cx4="http://schemas.microsoft.com/office/drawing/2016/5/10/chartex" xmlns:cx5="http://schemas.microsoft.com/office/drawing/2016/5/11/chartex" xmlns:cx6="http://schemas.microsoft.com/office/drawing/2016/5/12/chartex" xmlns:cx7="http://schemas.microsoft.com/office/drawing/2016/5/13/chartex" xmlns:cx8="http://schemas.microsoft.com/office/drawing/2016/5/14/chartex" xmlns:mc="http://schemas.openxmlformats.org/markup-compatibility/2006" xmlns:aink="http://schemas.microsoft.com/office/drawing/2016/ink" xmlns:am3d="http://schemas.microsoft.com/office/drawing/2017/model3d" xmlns:o="urn:schemas-microsoft-com:office:office" xmlns:oel="http://schemas.microsoft.com/office/2019/extlst" xmlns:r="http://schemas.openxmlformats.org/officeDocument/2006/relationships" xmlns:m="http://schemas.openxmlformats.org/officeDocument/2006/math" xmlns:v="urn:schemas-microsoft-com:vml" xmlns:wp14="http://schemas.microsoft.com/office/word/2010/wordprocessingDrawing" xmlns:wp="http://schemas.openxmlformats.org/drawingml/2006/wordprocessingDrawing" xmlns:w10="urn:schemas-microsoft-com:office:word" xmlns:w="http://schemas.openxmlformats.org/wordprocessingml/2006/main" xmlns:w14="http://schemas.microsoft.com/office/word/2010/wordml" xmlns:w15="http://schemas.microsoft.com/office/word/2012/wordml" xmlns:w16cex="http://schemas.microsoft.com/office/word/2018/wordml/cex" xmlns:w16cid="http://schemas.microsoft.com/office/word/2016/wordml/cid" xmlns:w16="http://schemas.microsoft.com/office/word/2018/wordml" xmlns:w16du="http://schemas.microsoft.com/office/word/2023/wordml/word16du" xmlns:w16sdtdh="http://schemas.microsoft.com/office/word/2020/wordml/sdtdatahash" xmlns:w16sdtfl="http://schemas.microsoft.com/office/word/2024/wordml/sdtformatlock" xmlns:w16se="http://schemas.microsoft.com/office/word/2015/wordml/symex" xmlns:wpg="http://schemas.microsoft.com/office/word/2010/wordprocessingGroup" xmlns:wpi="http://schemas.microsoft.com/office/word/2010/wordprocessingInk" xmlns:wne="http://schemas.microsoft.com/office/word/2006/wordml" xmlns:wps="http://schemas.microsoft.com/office/word/2010/wordprocessingShape" mc:Ignorable="w14 w15 w16se w16cid w16 w16cex w16sdtdh w16sdtfl w16du wp14">
   <w:abstractNum w:abstractNumId="0" w15:restartNumberingAfterBreak="0">
+    <w:nsid w:val="6A3C498E"/>
+    <w:multiLevelType w:val="multilevel"/>
+    <w:tmpl w:val="3B84B612"/>
+    <w:lvl w:ilvl="0">
+      <w:start w:val="1"/>
+      <w:numFmt w:val="bullet"/>
+      <w:lvlText w:val=""/>
+      <w:lvlJc w:val="left"/>
+      <w:pPr>
+        <w:tabs>
+          <w:tab w:val="num" w:pos="720"/>
+        </w:tabs>
+        <w:ind w:left="720" w:hanging="360"/>
+      </w:pPr>
+      <w:rPr>
+        <w:rFonts w:ascii="Symbol" w:hAnsi="Symbol" w:hint="default"/>
+        <w:sz w:val="20"/>
+      </w:rPr>
+    </w:lvl>
+    <w:lvl w:ilvl="1" w:tentative="1">
+      <w:start w:val="1"/>
+      <w:numFmt w:val="bullet"/>
+      <w:lvlText w:val="o"/>
+      <w:lvlJc w:val="left"/>
+      <w:pPr>
+        <w:tabs>
+          <w:tab w:val="num" w:pos="1440"/>
+        </w:tabs>
+        <w:ind w:left="1440" w:hanging="360"/>
+      </w:pPr>
+      <w:rPr>
+        <w:rFonts w:ascii="Courier New" w:hAnsi="Courier New" w:hint="default"/>
+        <w:sz w:val="20"/>
+      </w:rPr>
+    </w:lvl>
+    <w:lvl w:ilvl="2" w:tentative="1">
+      <w:start w:val="1"/>
+      <w:numFmt w:val="bullet"/>
+      <w:lvlText w:val=""/>
+      <w:lvlJc w:val="left"/>
+      <w:pPr>
+        <w:tabs>
+          <w:tab w:val="num" w:pos="2160"/>
+        </w:tabs>
+        <w:ind w:left="2160" w:hanging="360"/>
+      </w:pPr>
+      <w:rPr>
+        <w:rFonts w:ascii="Wingdings" w:hAnsi="Wingdings" w:hint="default"/>
+        <w:sz w:val="20"/>
+      </w:rPr>
+    </w:lvl>
+    <w:lvl w:ilvl="3" w:tentative="1">
+      <w:start w:val="1"/>
+      <w:numFmt w:val="bullet"/>
+      <w:lvlText w:val=""/>
+      <w:lvlJc w:val="left"/>
+      <w:pPr>
+        <w:tabs>
+          <w:tab w:val="num" w:pos="2880"/>
+        </w:tabs>
+        <w:ind w:left="2880" w:hanging="360"/>
+      </w:pPr>
+      <w:rPr>
+        <w:rFonts w:ascii="Wingdings" w:hAnsi="Wingdings" w:hint="default"/>
+        <w:sz w:val="20"/>
+      </w:rPr>
+    </w:lvl>
+    <w:lvl w:ilvl="4" w:tentative="1">
+      <w:start w:val="1"/>
+      <w:numFmt w:val="bullet"/>
+      <w:lvlText w:val=""/>
+      <w:lvlJc w:val="left"/>
+      <w:pPr>
+        <w:tabs>
+          <w:tab w:val="num" w:pos="3600"/>
+        </w:tabs>
+        <w:ind w:left="3600" w:hanging="360"/>
+      </w:pPr>
+      <w:rPr>
+        <w:rFonts w:ascii="Wingdings" w:hAnsi="Wingdings" w:hint="default"/>
+        <w:sz w:val="20"/>
+      </w:rPr>
+    </w:lvl>
+    <w:lvl w:ilvl="5" w:tentative="1">
+      <w:start w:val="1"/>
+      <w:numFmt w:val="bullet"/>
+      <w:lvlText w:val=""/>
+      <w:lvlJc w:val="left"/>
+      <w:pPr>
+        <w:tabs>
+          <w:tab w:val="num" w:pos="4320"/>
+        </w:tabs>
+        <w:ind w:left="4320" w:hanging="360"/>
+      </w:pPr>
+      <w:rPr>
+        <w:rFonts w:ascii="Wingdings" w:hAnsi="Wingdings" w:hint="default"/>
+        <w:sz w:val="20"/>
+      </w:rPr>
+    </w:lvl>
+    <w:lvl w:ilvl="6" w:tentative="1">
+      <w:start w:val="1"/>
+      <w:numFmt w:val="bullet"/>
+      <w:lvlText w:val=""/>
+      <w:lvlJc w:val="left"/>
+      <w:pPr>
+        <w:tabs>
+          <w:tab w:val="num" w:pos="5040"/>
+        </w:tabs>
+        <w:ind w:left="5040" w:hanging="360"/>
+      </w:pPr>
+      <w:rPr>
+        <w:rFonts w:ascii="Wingdings" w:hAnsi="Wingdings" w:hint="default"/>
+        <w:sz w:val="20"/>
+      </w:rPr>
+    </w:lvl>
+    <w:lvl w:ilvl="7" w:tentative="1">
+      <w:start w:val="1"/>
+      <w:numFmt w:val="bullet"/>
+      <w:lvlText w:val=""/>
+      <w:lvlJc w:val="left"/>
+      <w:pPr>
+        <w:tabs>
+          <w:tab w:val="num" w:pos="5760"/>
+        </w:tabs>
+        <w:ind w:left="5760" w:hanging="360"/>
+      </w:pPr>
+      <w:rPr>
+        <w:rFonts w:ascii="Wingdings" w:hAnsi="Wingdings" w:hint="default"/>
+        <w:sz w:val="20"/>
+      </w:rPr>
+    </w:lvl>
+    <w:lvl w:ilvl="8" w:tentative="1">
+      <w:start w:val="1"/>
+      <w:numFmt w:val="bullet"/>
+      <w:lvlText w:val=""/>
+      <w:lvlJc w:val="left"/>
+      <w:pPr>
+        <w:tabs>
+          <w:tab w:val="num" w:pos="6480"/>
+        </w:tabs>
+        <w:ind w:left="6480" w:hanging="360"/>
+      </w:pPr>
+      <w:rPr>
+        <w:rFonts w:ascii="Wingdings" w:hAnsi="Wingdings" w:hint="default"/>
+        <w:sz w:val="20"/>
+      </w:rPr>
+    </w:lvl>
+  </w:abstractNum>
+  <w:abstractNum w:abstractNumId="1" w15:restartNumberingAfterBreak="0">
     <w:nsid w:val="6A9C2A5B"/>
     <w:multiLevelType w:val="multilevel"/>
     <w:tmpl w:val="4BDA4B8E"/>
@@ -491,16 +764,10 @@
     </w:lvl>
   </w:abstractNum>
   <w:num w:numId="1" w16cid:durableId="45371496">
+    <w:abstractNumId w:val="1"/>
+  </w:num>
+  <w:num w:numId="2" w16cid:durableId="976034575">
     <w:abstractNumId w:val="0"/>
-    <w:lvlOverride w:ilvl="0"/>
-    <w:lvlOverride w:ilvl="1"/>
-    <w:lvlOverride w:ilvl="2"/>
-    <w:lvlOverride w:ilvl="3"/>
-    <w:lvlOverride w:ilvl="4"/>
-    <w:lvlOverride w:ilvl="5"/>
-    <w:lvlOverride w:ilvl="6"/>
-    <w:lvlOverride w:ilvl="7"/>
-    <w:lvlOverride w:ilvl="8"/>
   </w:num>
 </w:numbering>
 </file>

</xml_diff>